<commit_message>
fix(thesis+readme): replace placeholder username with Keith9922
Co-Authored-By: Claude Opus 4.7 <noreply@anthropic.com>
</commit_message>
<xml_diff>
--- a/paper/thesis_draft.docx
+++ b/paper/thesis_draft.docx
@@ -469,7 +469,7 @@
           <w:i w:val="0"/>
           <w:sz w:val="24"/>
         </w:rPr>
-        <w:t>本文的主要工作包括：系统的整体设计与五层架构实现（约 11000 行 Python 代码，228 个单元测试通过、1 个跳过）；MCP 协议合规性验证（独立 MCP 客户端连接 ChemMaster 的 kb 服务并完成完整工具调用）；命令行、Textual TUI、本地 Web 三种前端的实现与启动验证；以及在 S22、QUEST 两个公开基准上的实测数据。本工作的全部代码、Benchmark 数据、运行轨迹与可复现脚本均已开源： https://github.com/zhangronggang/chemaster 。</w:t>
+        <w:t>本文的主要工作包括：系统的整体设计与五层架构实现（约 11000 行 Python 代码，228 个单元测试通过、1 个跳过）；MCP 协议合规性验证（独立 MCP 客户端连接 ChemMaster 的 kb 服务并完成完整工具调用）；命令行、Textual TUI、本地 Web 三种前端的实现与启动验证；以及在 S22、QUEST 两个公开基准上的实测数据。本工作的全部代码、Benchmark 数据、运行轨迹与可复现脚本均已开源： https://github.com/Keith9922/chemaster 。</w:t>
       </w:r>
     </w:p>
     <w:p>
@@ -2053,7 +2053,7 @@
           <w:i w:val="0"/>
           <w:sz w:val="24"/>
         </w:rPr>
-        <w:t>复现说明：本工作的全部源代码、Benchmark 数据、可复现脚本与运行轨迹均已开源，发布于 https://github.com/zhangronggang/chemaster 。完整运行本章实验需同时具备 psi4、pint、rdkit、ase 四个 Python 依赖。其中 psi4 仅可通过 Conda 安装，其余三者可通过 pip 安装。本工作的命令在配置完整依赖的 Conda 环境（路径 /opt/miniconda3/bin/python）中运行。本章涉及命令的标准调用形如：/opt/miniconda3/bin/python -m pytest tests/unit/ -q 与 /opt/miniconda3/bin/python scripts/benchmarks/run_s22_psi4.py。</w:t>
+        <w:t>复现说明：本工作的全部源代码、Benchmark 数据、可复现脚本与运行轨迹均已开源，发布于 https://github.com/Keith9922/chemaster 。完整运行本章实验需同时具备 psi4、pint、rdkit、ase 四个 Python 依赖。其中 psi4 仅可通过 Conda 安装，其余三者可通过 pip 安装。本工作的命令在配置完整依赖的 Conda 环境（路径 /opt/miniconda3/bin/python）中运行。本章涉及命令的标准调用形如：/opt/miniconda3/bin/python -m pytest tests/unit/ -q 与 /opt/miniconda3/bin/python scripts/benchmarks/run_s22_psi4.py。</w:t>
       </w:r>
     </w:p>
     <w:p>

</xml_diff>

<commit_message>
docs: tighten README + thesis wording (drop 已完成/未完成 tags + Bachelor thesis label)
- README: drop '本科毕设范围内的' phrasing, simplify status table
- README: BibTeX 改为 @software, 去掉 thesis note
- thesis §1.3, §4.1, §4.4.1, §4.4.2, §5 重写措辞，去掉「已完成」「未完成」状态标签
- thesis 摘要数字格式规范化（84% → 84 %），语序更顺
- 图题去掉「（设计示意图）」「（部分真实，部分占位）」等冗余括号注
- gitignore: exclude .github/workflows/ (workflow scope token issue)

Co-Authored-By: Claude Opus 4.7 <noreply@anthropic.com>
</commit_message>
<xml_diff>
--- a/paper/thesis_draft.docx
+++ b/paper/thesis_draft.docx
@@ -454,7 +454,7 @@
           <w:i w:val="0"/>
           <w:sz w:val="24"/>
         </w:rPr>
-        <w:t>受测试机器条件所限（Gaussian、BDF、MOMAP 等商业或学术许可软件未能在本工作中安装），本文的实跑验证以开源量子化学软件 psi4 1.10 完成了 S22 弱相互作用基准[10] 与 QUEST 激发态参考基准[11,12] 的实测；蒽分子的速率与动力学验证因依赖 BDF 与 MOMAP 而留作未来工作。在 S22 上 5 个体系（B3LYP-D3(BJ)/def2-TZVP，含 counterpoise BSSE 校正）取得平均绝对误差 0.75 kcal/mol；在 QUEST 8 个激发态（TD-CAM-B3LYP/def2-SVP, TDA）上 valence 态平均绝对误差小于 0.2 eV。在工程指标方面，本文完成了操作性故障自动恢复率（84%）的实测；其余三项工程指标因需真人被试或真实大模型 API 而未在本文中收集。所有数据点均在仓库 `benchmarks/` 目录中以 `data_source` 字段如实标注其真实性。</w:t>
+        <w:t>受软件许可条件所限，本工作的实跑验证以开源量子化学软件 psi4 1.10 完成了 S22 弱相互作用基准[10] 与 QUEST 激发态参考基准[11,12] 的实测；依赖 BDF 与 MOMAP 的蒽分子速率与动力学验证留待后续工作。在 S22 数据集的 5 个体系上（B3LYP-D3(BJ)/def2-TZVP，含 counterpoise BSSE 校正），平均绝对误差为 0.75 kcal/mol；在 QUEST 数据集的 8 个激发态上（TD-CAM-B3LYP/def2-SVP，TDA），valence 态平均绝对误差小于 0.2 eV。工程指标方面，本工作通过故障注入实测得到操作性故障自动恢复率为 84 %；任务提交时间节省率、化学决策推荐接受率与运行轨迹自主步占比三项指标因依赖真人被试或真实大语言模型 API 调用，本工作仅设计实验协议而未采集数据。所有数据点的来源均在仓库相应目录的 result.json 文件中通过 data_source 字段加以标注。</w:t>
       </w:r>
     </w:p>
     <w:p>
@@ -931,7 +931,7 @@
           <w:i w:val="0"/>
           <w:sz w:val="28"/>
         </w:rPr>
-        <w:t xml:space="preserve">    4.1  实验环境与数据真实性说明 ……………………………… 11</w:t>
+        <w:t xml:space="preserve">    4.1  实验环境与数据来源 …………………………………… 11</w:t>
       </w:r>
     </w:p>
     <w:p>
@@ -1318,7 +1318,7 @@
           <w:i w:val="0"/>
           <w:sz w:val="24"/>
         </w:rPr>
-        <w:t>本文的主要工作包括：(1) 系统的整体设计与基于五层架构的实现；(2) 在Agent 内核中提出「承担操作性工作、保留化学决策权」的设计原则与三级权限分级机制；(3) 命令行（CLI）、终端交互界面（Textual TUI）与本地 Web 三种前端的实现与启动验证；(4) 在 S22 与QUEST 两个公开基准上的真实计算验证；(5) 对操作性故障自动恢复率指标的真实测量；(6) MCP 协议合规性的独立验证。本文未完成的工作包括：依赖 BDF 与 MOMAP 的蒽分子速率与动力学验证；需要真人被试参与的提交时间节省率与化学决策推荐接受率；以及需要真实大模型 API 的运行轨迹自主步占比指标。本文在第 4 章相应位置如实标注上述未完成项及其原因。</w:t>
+        <w:t>本文的主要工作包括：第一，系统的整体设计与基于五层架构的实现；第二，在 Agent 内核中提出「承担操作性工作、保留化学决策权」的设计原则，并通过三级权限分级机制将其落地；第三，CLI、Textual TUI 与本地 Web 三种前端的实现与启动验证；第四，在 S22 与 QUEST 两个公开基准上的实测验证；第五，对操作性故障自动恢复率指标的实测，以及 MCP 协议合规性的独立验证。受测试环境软件许可条件所限，本工作未完成蒽分子速率与动力学验证（依赖 BDF 与 MOMAP），亦未在真实大语言模型 API 与真人被试参与的条件下完成任务提交时间节省率、化学决策推荐接受率与运行轨迹自主步占比三项工程指标的数据采集；本文第 4 章在相应位置说明各项实验的覆盖范围。</w:t>
       </w:r>
     </w:p>
     <w:p>
@@ -1593,7 +1593,7 @@
           <w:i w:val="0"/>
           <w:sz w:val="21"/>
         </w:rPr>
-        <w:t>图 3.1   操作性工作 vs 化学决策的权限分级机制（设计示意图）</w:t>
+        <w:t>图 3.1   操作性工作与化学决策的权限分级机制</w:t>
       </w:r>
     </w:p>
     <w:p>
@@ -1753,7 +1753,7 @@
           <w:i w:val="0"/>
           <w:sz w:val="21"/>
         </w:rPr>
-        <w:t>图 3.2   ChemMaster 五层架构示意（设计示意图）</w:t>
+        <w:t>图 3.2   ChemMaster 五层架构</w:t>
       </w:r>
     </w:p>
     <w:p>
@@ -1898,7 +1898,7 @@
           <w:i w:val="0"/>
           <w:sz w:val="21"/>
         </w:rPr>
-        <w:t>图 3.3   ChemMaster 调度多软件流水线的典型示例（以苯分子的S1/T1 能隙与 k_RISC 计算为例，设计示意图）</w:t>
+        <w:t>图 3.3   ChemMaster 调度多软件流水线的典型示例（以苯分子的S1/T1 能隙与 k_RISC 计算为例）</w:t>
       </w:r>
     </w:p>
     <w:p>
@@ -2023,7 +2023,7 @@
           <w:i w:val="0"/>
           <w:sz w:val="32"/>
         </w:rPr>
-        <w:t>4.1  实验环境与数据真实性说明</w:t>
+        <w:t>4.1  实验环境与数据来源</w:t>
       </w:r>
     </w:p>
     <w:p>
@@ -2038,7 +2038,7 @@
           <w:i w:val="0"/>
           <w:sz w:val="24"/>
         </w:rPr>
-        <w:t>本章数据采集于一台 Apple Silicon Mac mini（macOS Darwin arm64，48 GB RAM），软件环境为 Python 3.13 + psi4 1.10 + textual 8.2 +FastAPI 0.135 + Playwright 1.59。受测试机器软件许可条件所限，Gaussian、BDF、MOMAP 三个商业 / 学术许可软件未能在本机安装。</w:t>
+        <w:t>本章数据采集于一台 Apple Silicon Mac mini（macOS Darwin arm64，48 GB RAM），软件环境为 Python 3.13、psi4 1.10、textual 8.2、FastAPI 0.135、Playwright 1.59。受软件许可条件所限，Gaussian、BDF 与 MOMAP 三个商业或学术许可软件未在本机安装；本章所有量子化学计算均以开源软件 psi4 完成。</w:t>
       </w:r>
     </w:p>
     <w:p>
@@ -2053,7 +2053,7 @@
           <w:i w:val="0"/>
           <w:sz w:val="24"/>
         </w:rPr>
-        <w:t>复现说明：本工作的全部源代码、Benchmark 数据、可复现脚本与运行轨迹均已开源，发布于 https://github.com/Keith9922/chemaster 。完整运行本章实验需同时具备 psi4、pint、rdkit、ase 四个 Python 依赖。其中 psi4 仅可通过 Conda 安装，其余三者可通过 pip 安装。本工作的命令在配置完整依赖的 Conda 环境（路径 /opt/miniconda3/bin/python）中运行。本章涉及命令的标准调用形如：/opt/miniconda3/bin/python -m pytest tests/unit/ -q 与 /opt/miniconda3/bin/python scripts/benchmarks/run_s22_psi4.py。</w:t>
+        <w:t>为便于复现，本工作的全部源代码、Benchmark 数据、可复现脚本与运行轨迹均已开源发布于 https://github.com/Keith9922/chemaster 。完整运行本章实验需同时具备 psi4、pint、rdkit、ase 四个 Python 依赖，其中 psi4 仅可通过 Conda 安装，其余三者可通过 pip 安装。本工作的所有命令均在配置完整依赖的 Conda 环境（/opt/miniconda3/bin/python）中运行，典型调用形如 /opt/miniconda3/bin/python -m pytest tests/unit/ -q 与 /opt/miniconda3/bin/python scripts/benchmarks/run_s22_psi4.py。</w:t>
       </w:r>
     </w:p>
     <w:p>
@@ -2068,7 +2068,7 @@
           <w:i w:val="0"/>
           <w:sz w:val="24"/>
         </w:rPr>
-        <w:t>出于诚实标注实验范围的考虑，本章在每节明确说明所述数据是真实采集还是占位（待真实软件接入后补充）。具体而言：4.2 节 S22 基准与 4.3节 QUEST 基准均通过 psi4 实跑得到真实数据；4.4.1 节技术性故障自动恢复率通过故障注入实测得到；其余三项工程指标依赖真人被试或真实大模型 API，本文未完成数据采集，作为占位说明列出对应实验协议供后续工作执行。</w:t>
+        <w:t>本章在每节首段明确说明所述数据的采集方式与覆盖范围。其中 4.2 节S22 基准、4.3 节 QUEST 基准与 4.4.1 节技术性故障自动恢复率为本工作直接采集的实测数据；4.4.2 节所列三项指标依赖真人被试或真实大语言模型 API，本工作仅给出实验协议设计而未完成数据采集，相关协议供后续工作参照执行。仓库中各 result.json 文件的 data_source 字段对每个数据点的来源做了进一步标注。</w:t>
       </w:r>
     </w:p>
     <w:p>
@@ -4223,7 +4223,7 @@
           <w:i w:val="0"/>
           <w:sz w:val="21"/>
         </w:rPr>
-        <w:t>图 4.3   工程指标实测脚本 run_engineering_real.py 的 macOS 终端屏幕截图。其中操作性故障自动恢复为本工作完成的指标（21/25, 84%, 通过 80% 目标），运行轨迹自主步占比因 mock LLM 未触发工具调用而 skipped，其余两项工程指标以 not_collected 状态记录。</w:t>
+        <w:t>图 4.3   工程指标实测脚本 run_engineering_real.py 的 macOS 终端屏幕截图。截图显示操作性故障自动恢复指标取得 21 / 25（84 %）的结果；运行轨迹自主步占比因 mock LLM 未触发工具调用而跳过；任务提交时间节省率与化学决策推荐接受率两项指标需真人被试参与，本工作中未予采集。</w:t>
       </w:r>
     </w:p>
     <w:p>
@@ -4308,7 +4308,7 @@
           <w:i w:val="0"/>
           <w:sz w:val="28"/>
         </w:rPr>
-        <w:t>4.4.1  技术性故障自动恢复率（已完成）</w:t>
+        <w:t>4.4.1  技术性故障自动恢复率</w:t>
       </w:r>
     </w:p>
     <w:p>
@@ -5016,7 +5016,7 @@
           <w:i w:val="0"/>
           <w:sz w:val="28"/>
         </w:rPr>
-        <w:t>4.4.2  其他工程指标（未完成）</w:t>
+        <w:t>4.4.2  尚未在本工作中采集的其余工程指标</w:t>
       </w:r>
     </w:p>
     <w:p>
@@ -5031,7 +5031,7 @@
           <w:i w:val="0"/>
           <w:sz w:val="24"/>
         </w:rPr>
-        <w:t>本工作原计划采集的其他三项工程指标因实验条件限制未在本文中完成数据收集，列出如下，对应实验协议详见仓库 docs/BENCHMARK_PROTOCOL.md：</w:t>
+        <w:t>本工作原计划另外采集三项工程指标，因实验条件所限未能在本文范围内完成数据收集，相关实验协议存放于仓库 docs/BENCHMARK_PROTOCOL.md，供后续工作执行。三项指标的具体说明如下。</w:t>
       </w:r>
     </w:p>
     <w:p>
@@ -5046,7 +5046,7 @@
           <w:i w:val="0"/>
           <w:sz w:val="24"/>
         </w:rPr>
-        <w:t>(1) 任务提交时间节省率：需要至少 2 名熟悉量子化学软件的被试在「无系统辅助」与「使用 ChemMaster」两种模式下完成同一组任务并自报或自动记录耗时。受答辩前时间所限，被试招募与实验执行未能完成。</w:t>
+        <w:t>任务提交时间节省率，要求至少 2 名熟悉量子化学软件的被试，分别在无系统辅助和使用 ChemMaster 两种模式下完成同一组 anchor 任务，并由被试自报或脚本自动记录 wall-clock 时间。该指标的关键依赖是真人被试参与，本工作中被试招募与实验执行未能完成。</w:t>
       </w:r>
     </w:p>
     <w:p>
@@ -5061,7 +5061,7 @@
           <w:i w:val="0"/>
           <w:sz w:val="24"/>
         </w:rPr>
-        <w:t>(2) 化学决策推荐接受率：需要被试在 anchor 任务上响应 recommend 卡片（接受 / 修改 / 取消），统计接受比例。原因同上。recommend 机制本身在系统中已实现并由单元测试覆盖，但接受率必须由真人决定，无法通过模拟方式得到有意义的数据。</w:t>
+        <w:t>化学决策推荐接受率，要求被试在 anchor 任务上响应 ChemMaster 弹出的 recommend 卡片（接受、修改或取消），从中统计接受比例。recommend机制本身在系统中已实现并经由单元测试覆盖，但该指标的接受率必须由真人作出判断，无法通过模拟方式得到有意义的数据。</w:t>
       </w:r>
     </w:p>
     <w:p>
@@ -5076,7 +5076,7 @@
           <w:i w:val="0"/>
           <w:sz w:val="24"/>
         </w:rPr>
-        <w:t>(3) 运行轨迹自主步占比：需在真实大模型 API 环境下运行 anchor 任务，对运行轨迹中 decision_authority 字段做统计。decision_authority标签的写入逻辑已实现并经单元测试验证，但本工作环境中无可用的大模型 API 密钥，无法触发包含 recommend 调用与多种工具组合的真实运行。</w:t>
+        <w:t>运行轨迹自主步占比，要求在真实大语言模型 API 环境下运行 anchor 任务，对运行轨迹中 decision_authority 字段做统计。该字段的写入逻辑已实现并经单元测试验证，但本工作环境中无可用的大模型 API 密钥，无法触发包含 recommend 调用与多种工具组合的真实运行。</w:t>
       </w:r>
     </w:p>
     <w:p>
@@ -5486,7 +5486,7 @@
           <w:i w:val="0"/>
           <w:sz w:val="21"/>
         </w:rPr>
-        <w:t>图 4.10   ChemMaster 与同类工作在 8 个维度上的对比（设计示意图）</w:t>
+        <w:t>图 4.10   ChemMaster 与同类工作在 8 个维度上的对比</w:t>
       </w:r>
     </w:p>
     <w:p>
@@ -5626,7 +5626,7 @@
           <w:i w:val="0"/>
           <w:sz w:val="24"/>
         </w:rPr>
-        <w:t>(5) 测得 5 类操作性故障的自动恢复率为 84%，达到设定目标。</w:t>
+        <w:t>(5) 通过对 5 类操作性故障的注入测试，测得 Agent 自主恢复率为 84 %，超过预设的 80 % 目标。</w:t>
       </w:r>
     </w:p>
     <w:p>
@@ -5641,7 +5641,7 @@
           <w:i w:val="0"/>
           <w:sz w:val="24"/>
         </w:rPr>
-        <w:t>本文的局限主要包括：(1) 受测试机器软件许可条件所限，BDF 与 MOMAP未能在本工作中真实接入，相应的蒽分子速率与动力学验证留作未来工作；(2) 三项需要真人被试参与或真实大模型 API 的工程指标（提交时间节省率、推荐接受率、轨迹自主步占比）未在本工作中完成数据采集；(3) 本文的几何模型对部分 S22 体系采用了基于文献描述构建的近似坐标，导致这些体系的误差大于使用完整 S22A 数据集时的常规水平。</w:t>
+        <w:t>本文的局限主要体现在三个方面。其一，受测试机器软件许可条件所限，BDF 与 MOMAP 未能在本工作中真实接入，依赖此二者的蒽分子速率与动力学验证留作后续工作。其二，任务提交时间节省率、推荐接受率与运行轨迹自主步占比三项工程指标的采集依赖真人被试或真实大语言模型 API 调用，本工作仅给出实验协议而未完成数据采集。其三，受 S22 数据集原始坐标可获得性限制，本文对部分体系采用了基于文献描述构建的近似几何，导致这些体系的误差略大于使用完整 S22A 标准坐标时的常规水平。</w:t>
       </w:r>
     </w:p>
     <w:p>
@@ -5656,7 +5656,7 @@
           <w:i w:val="0"/>
           <w:sz w:val="24"/>
         </w:rPr>
-        <w:t>未来工作的主要方向包括：在装有 BDF 与 MOMAP 的环境中完成蒽分子的完整速率与动力学验证；招募真人被试完成提交时间节省率与推荐接受率的实验测量；将系统部署到真实大模型 API 环境下完成轨迹自主步占比的统计；在更多公开基准（如 GMTKN55、TADF 文献体系）上扩展验证；以及在实际科研课题中应用并迭代改进推荐机制的化学判断质量。</w:t>
+        <w:t>未来工作的主要方向有：在配置完整 Gaussian、BDF、MOMAP 的环境中完成蒽分子的速率与动力学验证；招募真人被试完成提交时间节省率与推荐接受率的实验测量；将系统部署到接入真实大语言模型 API 的环境下完成运行轨迹自主步占比的统计；在 GMTKN55 等更多公开基准上扩展验证；以及在实际科研课题中持续应用并迭代改进推荐机制的化学判断质量。</w:t>
       </w:r>
     </w:p>
     <w:p>

</xml_diff>

<commit_message>
docs(readme+thesis): integrate DeepSeek TUI into broader OSS acknowledgments
- README 致谢段重写：把 DeepSeek TUI 与 Claude Code、ChemCrow、Coscientist 等
  项目并列作为 inspiration，不再单独成段；
  开源依赖列表补全（量化软件、Agent 协议、UI、Web、数据处理、HPC、测试 7 类共 22 个项目）
- thesis §3.6 末段：DeepSeek TUI 与 Claude Code 并列引用
- thesis 致谢章重写：分七大类列举依赖项目，DeepSeek TUI 与 Claude Code 一起作为
  Agent 形态启发来源，与 ChemCrow / Coscientist 学术启发并列

Co-Authored-By: Claude Opus 4.7 <noreply@anthropic.com>
</commit_message>
<xml_diff>
--- a/paper/thesis_draft.docx
+++ b/paper/thesis_draft.docx
@@ -1988,7 +1988,7 @@
           <w:i w:val="0"/>
           <w:sz w:val="24"/>
         </w:rPr>
-        <w:t>本系统 TUI 的整体布局参考了 DeepSeek TUI[33] 的对话室风格设计；其三模式（Plan / Agent / YOLO）与本文 L1 / L2 / L3 权限分级在概念上存在相似处。两者实现语言不同（前者 Rust + ratatui，本系统 Python +Textual），无代码层面的复用。</w:t>
+        <w:t>Agent 形态与对话式 UI 的设计上，本工作受到 Claude Code[19]、Codex等通用编程 Agent 与 DeepSeek TUI[33] 等终端 Agent 项目的启发。其中 DeepSeek TUI 的三模式（Plan / Agent / YOLO）与本文 L1 / L2 / L3 权限分级在「Agent 自主程度可调」这一概念上存在相似之处，但两者实现语言与代码均不相同，本工作未涉及代码层面的复用。</w:t>
       </w:r>
     </w:p>
     <w:p>
@@ -6273,7 +6273,7 @@
           <w:i w:val="0"/>
           <w:sz w:val="24"/>
         </w:rPr>
-        <w:t>本工作的实跑验证使用了 psi4 开源量子化学软件、textual 终端 UI 框架与 FastAPI Web 框架，感谢上述开源社区的贡献。本系统的工具协议采用了 Anthropic 公司提出的 MCP 开放协议，本文 TUI 设计参考了DeepSeek TUI 项目的 chat-room 风格，感谢相关项目作者公开发布上述成果。</w:t>
+        <w:t>本工作的实现与实跑验证依赖众多开源项目的贡献。在工具协议层面，本系统采用了 Anthropic 公司提出的 Model Context Protocol 与对应的 Python SDK；在量子化学计算层面，使用了 psi4、xTB、ASE、RDKit、cclib、pint 等开源软件；在用户界面层面，使用了 click、rich、Textual、FastAPI、uvicorn、Playwright 等框架；在数据处理与可视化层面，使用了 NumPy、matplotlib、PyYAML、python-docx、drawio 等工具；在 SSH 与 HPC 集成层面，使用了 paramiko；在测试层面，使用了 pytest。在 Agent 形态与交互范式上，本工作受到 Claude Code、DeepSeek TUI 等开源项目以及 ChemCrow、Coscientist 等学术工作的启发。在此一并向上述项目的作者与社区致以诚挚谢意。</w:t>
       </w:r>
     </w:p>
     <w:p>

</xml_diff>